<commit_message>
Whitepaper v2.0 update — founder allocation disclosure, Phase 6 conditional payments, fixed genesis date, language corrections
</commit_message>
<xml_diff>
--- a/whitepaper/ChronX_Whitepaper_v2.0.docx
+++ b/whitepaper/ChronX_Whitepaper_v2.0.docx
@@ -12,7 +12,7 @@
           <w:noProof/>
         </w:rPr>
         <w:drawing>
-          <wp:inline distT="0" distB="0" distL="0" distR="0" wp14:anchorId="4354E985" wp14:editId="2B8F6F8E">
+          <wp:inline distT="0" distB="0" distL="0" distR="0" wp14:anchorId="2FECAAD4" wp14:editId="25624D9A">
             <wp:extent cx="2667000" cy="447675"/>
             <wp:effectExtent l="0" t="0" r="0" b="0"/>
             <wp:docPr id="1" name="ChronX Logo" descr="ChronX Logo" title="ChronX"/>
@@ -5283,6 +5283,15 @@
     </w:p>
     <w:p>
       <w:pPr>
+        <w:spacing w:before="80" w:after="120"/>
+        <w:jc w:val="both"/>
+      </w:pPr>
+      <w:r>
+        <w:t>For transparency: the founding developer holds 100,000,000 KX (approximately 1.21% of total supply), drawn from the public sale allocation and disclosed at genesis. These funds are designated for seeding ecosystem interest, funding early development, and supporting protocol testing. No additional founder allocation exists beyond this disclosed amount.</w:t>
+      </w:r>
+    </w:p>
+    <w:p>
+      <w:pPr>
         <w:pStyle w:val="Heading2"/>
       </w:pPr>
       <w:r>
@@ -5929,6 +5938,7 @@
         <w:jc w:val="both"/>
       </w:pPr>
       <w:r>
+        <w:lastRenderedPageBreak/>
         <w:t>Its on-chain memo reads: “The humanity stake — 1,000,000 KX — locked until Jan 1 2127 00:00:00 UTC. The largest single promise in the ledger.”</w:t>
       </w:r>
     </w:p>
@@ -5993,7 +6003,6 @@
                 <w:sz w:val="23"/>
                 <w:szCs w:val="23"/>
               </w:rPr>
-              <w:lastRenderedPageBreak/>
               <w:t>The Humanity Stake</w:t>
             </w:r>
           </w:p>
@@ -6173,6 +6182,7 @@
         <w:pStyle w:val="Heading2"/>
       </w:pPr>
       <w:r>
+        <w:lastRenderedPageBreak/>
         <w:t>5.1 One Coin Per Person</w:t>
       </w:r>
     </w:p>
@@ -6182,7 +6192,6 @@
         <w:jc w:val="both"/>
       </w:pPr>
       <w:r>
-        <w:lastRenderedPageBreak/>
         <w:t xml:space="preserve">The total supply of 8,270,000,000 KX was chosen to match the world population on January 1, 2026. This is a statement of intent: </w:t>
       </w:r>
       <w:proofErr w:type="spellStart"/>
@@ -6392,6 +6401,7 @@
         <w:spacing w:before="60" w:after="60"/>
       </w:pPr>
       <w:r>
+        <w:lastRenderedPageBreak/>
         <w:t>Lock records carry versioned schemas — old locks remain valid as new lock versions are introduced</w:t>
       </w:r>
     </w:p>
@@ -6405,7 +6415,6 @@
         <w:spacing w:before="60" w:after="60"/>
       </w:pPr>
       <w:r>
-        <w:lastRenderedPageBreak/>
         <w:t xml:space="preserve">Certificate types are registered on-chain via governance, not hard-coded as </w:t>
       </w:r>
       <w:proofErr w:type="spellStart"/>
@@ -17319,10 +17328,10 @@
           <w:noProof/>
         </w:rPr>
         <w:drawing>
-          <wp:inline distT="0" distB="0" distL="0" distR="0" wp14:anchorId="38B76511" wp14:editId="6EAD05C7">
+          <wp:inline distT="0" distB="0" distL="0" distR="0" wp14:anchorId="4747C478" wp14:editId="2748F9ED">
             <wp:extent cx="1333500" cy="219075"/>
             <wp:effectExtent l="0" t="0" r="0" b="0"/>
-            <wp:docPr id="1766534284" name="ChronX Logo" descr="ChronX Logo" title="ChronX"/>
+            <wp:docPr id="980285674" name="ChronX Logo" descr="ChronX Logo" title="ChronX"/>
             <wp:cNvGraphicFramePr>
               <a:graphicFrameLocks xmlns:a="http://schemas.openxmlformats.org/drawingml/2006/main" noChangeAspect="1"/>
             </wp:cNvGraphicFramePr>
@@ -17639,64 +17648,150 @@
 <file path=word/numbering.xml><?xml version="1.0" encoding="utf-8"?>
 <w:numbering xmlns:wpc="http://schemas.microsoft.com/office/word/2010/wordprocessingCanvas" xmlns:cx="http://schemas.microsoft.com/office/drawing/2014/chartex" xmlns:cx1="http://schemas.microsoft.com/office/drawing/2015/9/8/chartex" xmlns:cx2="http://schemas.microsoft.com/office/drawing/2015/10/21/chartex" xmlns:cx3="http://schemas.microsoft.com/office/drawing/2016/5/9/chartex" xmlns:cx4="http://schemas.microsoft.com/office/drawing/2016/5/10/chartex" xmlns:cx5="http://schemas.microsoft.com/office/drawing/2016/5/11/chartex" xmlns:cx6="http://schemas.microsoft.com/office/drawing/2016/5/12/chartex" xmlns:cx7="http://schemas.microsoft.com/office/drawing/2016/5/13/chartex" xmlns:cx8="http://schemas.microsoft.com/office/drawing/2016/5/14/chartex" xmlns:mc="http://schemas.openxmlformats.org/markup-compatibility/2006" xmlns:aink="http://schemas.microsoft.com/office/drawing/2016/ink" xmlns:am3d="http://schemas.microsoft.com/office/drawing/2017/model3d" xmlns:o="urn:schemas-microsoft-com:office:office" xmlns:oel="http://schemas.microsoft.com/office/2019/extlst" xmlns:r="http://schemas.openxmlformats.org/officeDocument/2006/relationships" xmlns:m="http://schemas.openxmlformats.org/officeDocument/2006/math" xmlns:v="urn:schemas-microsoft-com:vml" xmlns:wp14="http://schemas.microsoft.com/office/word/2010/wordprocessingDrawing" xmlns:wp="http://schemas.openxmlformats.org/drawingml/2006/wordprocessingDrawing" xmlns:w10="urn:schemas-microsoft-com:office:word" xmlns:w="http://schemas.openxmlformats.org/wordprocessingml/2006/main" xmlns:w14="http://schemas.microsoft.com/office/word/2010/wordml" xmlns:w15="http://schemas.microsoft.com/office/word/2012/wordml" xmlns:w16cex="http://schemas.microsoft.com/office/word/2018/wordml/cex" xmlns:w16cid="http://schemas.microsoft.com/office/word/2016/wordml/cid" xmlns:w16="http://schemas.microsoft.com/office/word/2018/wordml" xmlns:w16du="http://schemas.microsoft.com/office/word/2023/wordml/word16du" xmlns:w16sdtdh="http://schemas.microsoft.com/office/word/2020/wordml/sdtdatahash" xmlns:w16sdtfl="http://schemas.microsoft.com/office/word/2024/wordml/sdtformatlock" xmlns:w16se="http://schemas.microsoft.com/office/word/2015/wordml/symex" xmlns:wpg="http://schemas.microsoft.com/office/word/2010/wordprocessingGroup" xmlns:wpi="http://schemas.microsoft.com/office/word/2010/wordprocessingInk" xmlns:wne="http://schemas.microsoft.com/office/word/2006/wordml" xmlns:wps="http://schemas.microsoft.com/office/word/2010/wordprocessingShape" mc:Ignorable="w14 w15 w16se w16cid w16 w16cex w16sdtdh w16sdtfl w16du wp14">
   <w:abstractNum w:abstractNumId="0" w15:restartNumberingAfterBreak="0">
-    <w:nsid w:val="124A446B"/>
+    <w:nsid w:val="068834FB"/>
     <w:multiLevelType w:val="hybridMultilevel"/>
-    <w:tmpl w:val="E54651C6"/>
-    <w:lvl w:ilvl="0" w:tplc="A16052DA">
+    <w:tmpl w:val="9E60679C"/>
+    <w:lvl w:ilvl="0" w:tplc="6B5873B0">
       <w:start w:val="1"/>
-      <w:numFmt w:val="bullet"/>
-      <w:lvlText w:val="✓"/>
+      <w:numFmt w:val="decimal"/>
+      <w:lvlText w:val="%1."/>
       <w:lvlJc w:val="left"/>
       <w:pPr>
         <w:ind w:left="720" w:hanging="360"/>
       </w:pPr>
     </w:lvl>
-    <w:lvl w:ilvl="1" w:tplc="E50A5888">
+    <w:lvl w:ilvl="1" w:tplc="A51A7450">
       <w:numFmt w:val="decimal"/>
       <w:lvlText w:val=""/>
       <w:lvlJc w:val="left"/>
     </w:lvl>
-    <w:lvl w:ilvl="2" w:tplc="B3AE8FB4">
+    <w:lvl w:ilvl="2" w:tplc="B30C5642">
       <w:numFmt w:val="decimal"/>
       <w:lvlText w:val=""/>
       <w:lvlJc w:val="left"/>
     </w:lvl>
-    <w:lvl w:ilvl="3" w:tplc="620CEF78">
+    <w:lvl w:ilvl="3" w:tplc="8E1C36EC">
       <w:numFmt w:val="decimal"/>
       <w:lvlText w:val=""/>
       <w:lvlJc w:val="left"/>
     </w:lvl>
-    <w:lvl w:ilvl="4" w:tplc="79948B5C">
+    <w:lvl w:ilvl="4" w:tplc="4D10B626">
       <w:numFmt w:val="decimal"/>
       <w:lvlText w:val=""/>
       <w:lvlJc w:val="left"/>
     </w:lvl>
-    <w:lvl w:ilvl="5" w:tplc="E6F4AD6A">
+    <w:lvl w:ilvl="5" w:tplc="7AA0CD42">
       <w:numFmt w:val="decimal"/>
       <w:lvlText w:val=""/>
       <w:lvlJc w:val="left"/>
     </w:lvl>
-    <w:lvl w:ilvl="6" w:tplc="33DE411A">
+    <w:lvl w:ilvl="6" w:tplc="E40079FC">
       <w:numFmt w:val="decimal"/>
       <w:lvlText w:val=""/>
       <w:lvlJc w:val="left"/>
     </w:lvl>
-    <w:lvl w:ilvl="7" w:tplc="CD5E0C18">
+    <w:lvl w:ilvl="7" w:tplc="13F87A8A">
       <w:numFmt w:val="decimal"/>
       <w:lvlText w:val=""/>
       <w:lvlJc w:val="left"/>
     </w:lvl>
-    <w:lvl w:ilvl="8" w:tplc="3D5C4E84">
+    <w:lvl w:ilvl="8" w:tplc="9FF405E6">
       <w:numFmt w:val="decimal"/>
       <w:lvlText w:val=""/>
       <w:lvlJc w:val="left"/>
     </w:lvl>
   </w:abstractNum>
   <w:abstractNum w:abstractNumId="1" w15:restartNumberingAfterBreak="0">
-    <w:nsid w:val="2221038A"/>
+    <w:nsid w:val="0A65747B"/>
     <w:multiLevelType w:val="hybridMultilevel"/>
-    <w:tmpl w:val="C7D48608"/>
-    <w:lvl w:ilvl="0" w:tplc="4E9652EA">
+    <w:tmpl w:val="E2F42DE8"/>
+    <w:lvl w:ilvl="0" w:tplc="A34283C0">
+      <w:start w:val="1"/>
+      <w:numFmt w:val="bullet"/>
+      <w:lvlText w:val="●"/>
+      <w:lvlJc w:val="left"/>
+      <w:pPr>
+        <w:ind w:left="720" w:hanging="360"/>
+      </w:pPr>
+    </w:lvl>
+    <w:lvl w:ilvl="1" w:tplc="D7A67544">
+      <w:start w:val="1"/>
+      <w:numFmt w:val="bullet"/>
+      <w:lvlText w:val="○"/>
+      <w:lvlJc w:val="left"/>
+      <w:pPr>
+        <w:ind w:left="1440" w:hanging="360"/>
+      </w:pPr>
+    </w:lvl>
+    <w:lvl w:ilvl="2" w:tplc="1F28B0F6">
+      <w:start w:val="1"/>
+      <w:numFmt w:val="bullet"/>
+      <w:lvlText w:val="■"/>
+      <w:lvlJc w:val="left"/>
+      <w:pPr>
+        <w:ind w:left="2160" w:hanging="360"/>
+      </w:pPr>
+    </w:lvl>
+    <w:lvl w:ilvl="3" w:tplc="5B6A46BE">
+      <w:start w:val="1"/>
+      <w:numFmt w:val="bullet"/>
+      <w:lvlText w:val="●"/>
+      <w:lvlJc w:val="left"/>
+      <w:pPr>
+        <w:ind w:left="2880" w:hanging="360"/>
+      </w:pPr>
+    </w:lvl>
+    <w:lvl w:ilvl="4" w:tplc="4DB43FCA">
+      <w:start w:val="1"/>
+      <w:numFmt w:val="bullet"/>
+      <w:lvlText w:val="○"/>
+      <w:lvlJc w:val="left"/>
+      <w:pPr>
+        <w:ind w:left="3600" w:hanging="360"/>
+      </w:pPr>
+    </w:lvl>
+    <w:lvl w:ilvl="5" w:tplc="9FAE4DC4">
+      <w:start w:val="1"/>
+      <w:numFmt w:val="bullet"/>
+      <w:lvlText w:val="■"/>
+      <w:lvlJc w:val="left"/>
+      <w:pPr>
+        <w:ind w:left="4320" w:hanging="360"/>
+      </w:pPr>
+    </w:lvl>
+    <w:lvl w:ilvl="6" w:tplc="B18E0886">
+      <w:start w:val="1"/>
+      <w:numFmt w:val="bullet"/>
+      <w:lvlText w:val="●"/>
+      <w:lvlJc w:val="left"/>
+      <w:pPr>
+        <w:ind w:left="5040" w:hanging="360"/>
+      </w:pPr>
+    </w:lvl>
+    <w:lvl w:ilvl="7" w:tplc="81DE8DE4">
+      <w:start w:val="1"/>
+      <w:numFmt w:val="bullet"/>
+      <w:lvlText w:val="●"/>
+      <w:lvlJc w:val="left"/>
+      <w:pPr>
+        <w:ind w:left="5760" w:hanging="360"/>
+      </w:pPr>
+    </w:lvl>
+    <w:lvl w:ilvl="8" w:tplc="04E41C98">
+      <w:start w:val="1"/>
+      <w:numFmt w:val="bullet"/>
+      <w:lvlText w:val="●"/>
+      <w:lvlJc w:val="left"/>
+      <w:pPr>
+        <w:ind w:left="6480" w:hanging="360"/>
+      </w:pPr>
+    </w:lvl>
+  </w:abstractNum>
+  <w:abstractNum w:abstractNumId="2" w15:restartNumberingAfterBreak="0">
+    <w:nsid w:val="15476A1C"/>
+    <w:multiLevelType w:val="hybridMultilevel"/>
+    <w:tmpl w:val="0A4C8A08"/>
+    <w:lvl w:ilvl="0" w:tplc="CD060A40">
       <w:start w:val="1"/>
       <w:numFmt w:val="bullet"/>
       <w:lvlText w:val="•"/>
@@ -17705,201 +17800,115 @@
         <w:ind w:left="720" w:hanging="360"/>
       </w:pPr>
     </w:lvl>
-    <w:lvl w:ilvl="1" w:tplc="4DBC94FE">
+    <w:lvl w:ilvl="1" w:tplc="91923688">
       <w:numFmt w:val="decimal"/>
       <w:lvlText w:val=""/>
       <w:lvlJc w:val="left"/>
     </w:lvl>
-    <w:lvl w:ilvl="2" w:tplc="54AEEC4A">
+    <w:lvl w:ilvl="2" w:tplc="8672347C">
       <w:numFmt w:val="decimal"/>
       <w:lvlText w:val=""/>
       <w:lvlJc w:val="left"/>
     </w:lvl>
-    <w:lvl w:ilvl="3" w:tplc="5D560090">
+    <w:lvl w:ilvl="3" w:tplc="DD28F1DE">
       <w:numFmt w:val="decimal"/>
       <w:lvlText w:val=""/>
       <w:lvlJc w:val="left"/>
     </w:lvl>
-    <w:lvl w:ilvl="4" w:tplc="DC900752">
+    <w:lvl w:ilvl="4" w:tplc="53707680">
       <w:numFmt w:val="decimal"/>
       <w:lvlText w:val=""/>
       <w:lvlJc w:val="left"/>
     </w:lvl>
-    <w:lvl w:ilvl="5" w:tplc="524A361C">
+    <w:lvl w:ilvl="5" w:tplc="AA88CDE6">
       <w:numFmt w:val="decimal"/>
       <w:lvlText w:val=""/>
       <w:lvlJc w:val="left"/>
     </w:lvl>
-    <w:lvl w:ilvl="6" w:tplc="1CA2D878">
+    <w:lvl w:ilvl="6" w:tplc="83025F6A">
       <w:numFmt w:val="decimal"/>
       <w:lvlText w:val=""/>
       <w:lvlJc w:val="left"/>
     </w:lvl>
-    <w:lvl w:ilvl="7" w:tplc="2F96FB02">
+    <w:lvl w:ilvl="7" w:tplc="E316711E">
       <w:numFmt w:val="decimal"/>
       <w:lvlText w:val=""/>
       <w:lvlJc w:val="left"/>
     </w:lvl>
-    <w:lvl w:ilvl="8" w:tplc="FF366E52">
+    <w:lvl w:ilvl="8" w:tplc="2DEAC420">
       <w:numFmt w:val="decimal"/>
       <w:lvlText w:val=""/>
       <w:lvlJc w:val="left"/>
     </w:lvl>
   </w:abstractNum>
-  <w:abstractNum w:abstractNumId="2" w15:restartNumberingAfterBreak="0">
-    <w:nsid w:val="34CA6483"/>
+  <w:abstractNum w:abstractNumId="3" w15:restartNumberingAfterBreak="0">
+    <w:nsid w:val="48827250"/>
     <w:multiLevelType w:val="hybridMultilevel"/>
-    <w:tmpl w:val="7542BF88"/>
-    <w:lvl w:ilvl="0" w:tplc="39586DEE">
+    <w:tmpl w:val="62F4A3BC"/>
+    <w:lvl w:ilvl="0" w:tplc="DF6CE534">
       <w:start w:val="1"/>
       <w:numFmt w:val="bullet"/>
-      <w:lvlText w:val="●"/>
+      <w:lvlText w:val="✓"/>
       <w:lvlJc w:val="left"/>
       <w:pPr>
         <w:ind w:left="720" w:hanging="360"/>
       </w:pPr>
     </w:lvl>
-    <w:lvl w:ilvl="1" w:tplc="CB88A244">
-      <w:start w:val="1"/>
-      <w:numFmt w:val="bullet"/>
-      <w:lvlText w:val="○"/>
-      <w:lvlJc w:val="left"/>
-      <w:pPr>
-        <w:ind w:left="1440" w:hanging="360"/>
-      </w:pPr>
-    </w:lvl>
-    <w:lvl w:ilvl="2" w:tplc="8EBAE5D8">
-      <w:start w:val="1"/>
-      <w:numFmt w:val="bullet"/>
-      <w:lvlText w:val="■"/>
-      <w:lvlJc w:val="left"/>
-      <w:pPr>
-        <w:ind w:left="2160" w:hanging="360"/>
-      </w:pPr>
-    </w:lvl>
-    <w:lvl w:ilvl="3" w:tplc="23B2B554">
-      <w:start w:val="1"/>
-      <w:numFmt w:val="bullet"/>
-      <w:lvlText w:val="●"/>
-      <w:lvlJc w:val="left"/>
-      <w:pPr>
-        <w:ind w:left="2880" w:hanging="360"/>
-      </w:pPr>
-    </w:lvl>
-    <w:lvl w:ilvl="4" w:tplc="D69C9A88">
-      <w:start w:val="1"/>
-      <w:numFmt w:val="bullet"/>
-      <w:lvlText w:val="○"/>
-      <w:lvlJc w:val="left"/>
-      <w:pPr>
-        <w:ind w:left="3600" w:hanging="360"/>
-      </w:pPr>
-    </w:lvl>
-    <w:lvl w:ilvl="5" w:tplc="D1F2DF90">
-      <w:start w:val="1"/>
-      <w:numFmt w:val="bullet"/>
-      <w:lvlText w:val="■"/>
-      <w:lvlJc w:val="left"/>
-      <w:pPr>
-        <w:ind w:left="4320" w:hanging="360"/>
-      </w:pPr>
-    </w:lvl>
-    <w:lvl w:ilvl="6" w:tplc="1804D092">
-      <w:start w:val="1"/>
-      <w:numFmt w:val="bullet"/>
-      <w:lvlText w:val="●"/>
-      <w:lvlJc w:val="left"/>
-      <w:pPr>
-        <w:ind w:left="5040" w:hanging="360"/>
-      </w:pPr>
-    </w:lvl>
-    <w:lvl w:ilvl="7" w:tplc="28E4FF50">
-      <w:start w:val="1"/>
-      <w:numFmt w:val="bullet"/>
-      <w:lvlText w:val="●"/>
-      <w:lvlJc w:val="left"/>
-      <w:pPr>
-        <w:ind w:left="5760" w:hanging="360"/>
-      </w:pPr>
-    </w:lvl>
-    <w:lvl w:ilvl="8" w:tplc="2EB2F092">
-      <w:start w:val="1"/>
-      <w:numFmt w:val="bullet"/>
-      <w:lvlText w:val="●"/>
-      <w:lvlJc w:val="left"/>
-      <w:pPr>
-        <w:ind w:left="6480" w:hanging="360"/>
-      </w:pPr>
-    </w:lvl>
-  </w:abstractNum>
-  <w:abstractNum w:abstractNumId="3" w15:restartNumberingAfterBreak="0">
-    <w:nsid w:val="4D2C4BF6"/>
-    <w:multiLevelType w:val="hybridMultilevel"/>
-    <w:tmpl w:val="AD5E99F6"/>
-    <w:lvl w:ilvl="0" w:tplc="FE7210D6">
-      <w:start w:val="1"/>
-      <w:numFmt w:val="decimal"/>
-      <w:lvlText w:val="%1."/>
-      <w:lvlJc w:val="left"/>
-      <w:pPr>
-        <w:ind w:left="720" w:hanging="360"/>
-      </w:pPr>
-    </w:lvl>
-    <w:lvl w:ilvl="1" w:tplc="5E706650">
+    <w:lvl w:ilvl="1" w:tplc="983CDD6E">
       <w:numFmt w:val="decimal"/>
       <w:lvlText w:val=""/>
       <w:lvlJc w:val="left"/>
     </w:lvl>
-    <w:lvl w:ilvl="2" w:tplc="6AFCBEB8">
+    <w:lvl w:ilvl="2" w:tplc="57C485B8">
       <w:numFmt w:val="decimal"/>
       <w:lvlText w:val=""/>
       <w:lvlJc w:val="left"/>
     </w:lvl>
-    <w:lvl w:ilvl="3" w:tplc="236A1606">
+    <w:lvl w:ilvl="3" w:tplc="85CC8310">
       <w:numFmt w:val="decimal"/>
       <w:lvlText w:val=""/>
       <w:lvlJc w:val="left"/>
     </w:lvl>
-    <w:lvl w:ilvl="4" w:tplc="45D0B4D8">
+    <w:lvl w:ilvl="4" w:tplc="7EF60AB0">
       <w:numFmt w:val="decimal"/>
       <w:lvlText w:val=""/>
       <w:lvlJc w:val="left"/>
     </w:lvl>
-    <w:lvl w:ilvl="5" w:tplc="75781444">
+    <w:lvl w:ilvl="5" w:tplc="61A2FF80">
       <w:numFmt w:val="decimal"/>
       <w:lvlText w:val=""/>
       <w:lvlJc w:val="left"/>
     </w:lvl>
-    <w:lvl w:ilvl="6" w:tplc="CBDAEFFE">
+    <w:lvl w:ilvl="6" w:tplc="78B2C81E">
       <w:numFmt w:val="decimal"/>
       <w:lvlText w:val=""/>
       <w:lvlJc w:val="left"/>
     </w:lvl>
-    <w:lvl w:ilvl="7" w:tplc="6E842952">
+    <w:lvl w:ilvl="7" w:tplc="E272B4A0">
       <w:numFmt w:val="decimal"/>
       <w:lvlText w:val=""/>
       <w:lvlJc w:val="left"/>
     </w:lvl>
-    <w:lvl w:ilvl="8" w:tplc="8C9E299A">
+    <w:lvl w:ilvl="8" w:tplc="F2C04A34">
       <w:numFmt w:val="decimal"/>
       <w:lvlText w:val=""/>
       <w:lvlJc w:val="left"/>
     </w:lvl>
   </w:abstractNum>
-  <w:num w:numId="1" w16cid:durableId="1670982294">
+  <w:num w:numId="1" w16cid:durableId="727611742">
+    <w:abstractNumId w:val="1"/>
+    <w:lvlOverride w:ilvl="0">
+      <w:startOverride w:val="1"/>
+    </w:lvlOverride>
+  </w:num>
+  <w:num w:numId="2" w16cid:durableId="1241865489">
     <w:abstractNumId w:val="2"/>
     <w:lvlOverride w:ilvl="0">
       <w:startOverride w:val="1"/>
     </w:lvlOverride>
   </w:num>
-  <w:num w:numId="2" w16cid:durableId="2133593966">
-    <w:abstractNumId w:val="1"/>
-    <w:lvlOverride w:ilvl="0">
-      <w:startOverride w:val="1"/>
-    </w:lvlOverride>
-  </w:num>
-  <w:num w:numId="3" w16cid:durableId="1099259564">
-    <w:abstractNumId w:val="0"/>
+  <w:num w:numId="3" w16cid:durableId="856430610">
+    <w:abstractNumId w:val="3"/>
     <w:lvlOverride w:ilvl="0">
       <w:startOverride w:val="1"/>
     </w:lvlOverride>

</xml_diff>

<commit_message>
Whitepaper v2.0 — roadmap reordered by complexity, 1inch DEX, CMC/CoinGecko listings, wKX on Base, third-party integrations reference
Co-Authored-By: Claude Sonnet 4.6 <noreply@anthropic.com>
</commit_message>
<xml_diff>
--- a/whitepaper/ChronX_Whitepaper_v2.0.docx
+++ b/whitepaper/ChronX_Whitepaper_v2.0.docx
@@ -12,7 +12,7 @@
           <w:noProof/>
         </w:rPr>
         <w:drawing>
-          <wp:inline distT="0" distB="0" distL="0" distR="0" wp14:anchorId="7A65AC4C" wp14:editId="298FD087">
+          <wp:inline distT="0" distB="0" distL="0" distR="0" wp14:anchorId="49909342" wp14:editId="4A6E2843">
             <wp:extent cx="2667000" cy="447675"/>
             <wp:effectExtent l="0" t="0" r="0" b="0"/>
             <wp:docPr id="1" name="ChronX Logo" descr="ChronX Logo" title="ChronX"/>
@@ -8351,7 +8351,7 @@
         <w:spacing w:before="60" w:after="60"/>
       </w:pPr>
       <w:r>
-        <w:t>Phase 3 — Exchange Launch (June 18, 2026 onward): wKX deployed on Base, 1inch liquidity pool seeded, chronx.io/exchange goes live. KX is immediately tradeable for USDC via 1inch with no CEX required. Participants who purchased at Founder or Visionary tier pricing are already below the launch price.</w:t>
+        <w:t>Phase 3 — Exchange Launch (June 18, 2026 onward): wKX deployed on Base, 1inch liquidity pool seeded with minimum $500–1,000 USDC, chronx.io/exchange goes live. KX is immediately tradeable for USDC via 1inch with no CEX required. Simultaneously, CoinMarketCap (coinmarketcap.com/application-form/listing/) and CoinGecko (coingecko.com/en/coins/new) listing applications submitted. Both platforms pull live price, volume, market cap, and chart data directly from the 1inch/Base liquidity pool once approved. CMC approval typically takes 2–8 weeks. CoinGecko is typically faster. Once listed, the ‘View KX on CoinMarketCap’ button in the wallet displays real live price data. Participants who purchased at Founder or Visionary tier pricing are already below the launch price.</w:t>
       </w:r>
     </w:p>
     <w:p>
@@ -8772,6 +8772,7 @@
         <w:jc w:val="both"/>
       </w:pPr>
       <w:r>
+        <w:lastRenderedPageBreak/>
         <w:t>At 10 KX per signup, even 100,000 new users costs less than 0.015% of the public sale allocation. The Try It Free program is designed to be sustainable at any scale of adoption.</w:t>
       </w:r>
     </w:p>
@@ -8803,7 +8804,7 @@
         <w:jc w:val="both"/>
       </w:pPr>
       <w:r>
-        <w:t>The ChronX roadmap is organized into five phases, each building on the last. Phase 1 is complete. Phases 2 through 5 represent the protocol’s evolution from a working blockchain to a complete future payments infrastructure. All protocol data structures necessary for Phases 2 through 5 are already present in the genesis codebase.</w:t>
+        <w:t>The ChronX roadmap is organized by complexity and delivery speed — simpler, higher-impact items first. Phase 1 is complete. Each subsequent phase builds on the last. All protocol data structures necessary for Phases 2 through 6 are already present in the genesis codebase — no hard fork required for any planned feature.</w:t>
       </w:r>
     </w:p>
     <w:p>
@@ -8959,6 +8960,32 @@
     </w:p>
     <w:p>
       <w:pPr>
+        <w:pStyle w:val="ListParagraph"/>
+        <w:numPr>
+          <w:ilvl w:val="0"/>
+          <w:numId w:val="3"/>
+        </w:numPr>
+        <w:spacing w:before="60" w:after="60"/>
+      </w:pPr>
+      <w:r>
+        <w:t>Protocol V3.2: conditional payment fields (dormant, forward-compatible)</w:t>
+      </w:r>
+    </w:p>
+    <w:p>
+      <w:pPr>
+        <w:pStyle w:val="ListParagraph"/>
+        <w:numPr>
+          <w:ilvl w:val="0"/>
+          <w:numId w:val="3"/>
+        </w:numPr>
+        <w:spacing w:before="60" w:after="60"/>
+      </w:pPr>
+      <w:r>
+        <w:t>Token sale commencing March 20, 2026 — the Equinox</w:t>
+      </w:r>
+    </w:p>
+    <w:p>
+      <w:pPr>
         <w:spacing w:before="120"/>
       </w:pPr>
     </w:p>
@@ -8967,7 +8994,16 @@
         <w:pStyle w:val="Heading2"/>
       </w:pPr>
       <w:r>
-        <w:t>Phase 2 — Accessibility</w:t>
+        <w:t>Phase 2 — Liquidity &amp; Market Presence</w:t>
+      </w:r>
+    </w:p>
+    <w:p>
+      <w:pPr>
+        <w:spacing w:before="80" w:after="120"/>
+        <w:jc w:val="both"/>
+      </w:pPr>
+      <w:r>
+        <w:t>Phase 2 is the highest-impact, lowest-complexity phase after launch. It establishes a real open market for KX within days of the token sale close, at minimal cost, with no intermediaries and no scammy exchange listings.</w:t>
       </w:r>
     </w:p>
     <w:p>
@@ -8980,7 +9016,7 @@
         <w:spacing w:before="60" w:after="60"/>
       </w:pPr>
       <w:r>
-        <w:t>Email-based locks — send KX to an email address, recipient claims by downloading wallet</w:t>
+        <w:t>Wrapped KX (wKX) — 1:1 backed ERC-20 token deployed on Base (Coinbase’s L2). Users never see the word ‘wrapped’ — the interface handles everything transparently.</w:t>
       </w:r>
     </w:p>
     <w:p>
@@ -8993,7 +9029,7 @@
         <w:spacing w:before="60" w:after="60"/>
       </w:pPr>
       <w:r>
-        <w:t>Off-chain email notification service — watches chain, sends claim notifications</w:t>
+        <w:t>1inch liquidity pool — wKX/USDC pool on Base seeded at launch (~$540 total cost). Real, non-custodial market from day one.</w:t>
       </w:r>
     </w:p>
     <w:p>
@@ -9006,7 +9042,7 @@
         <w:spacing w:before="60" w:after="60"/>
       </w:pPr>
       <w:r>
-        <w:t>Web wallet interface</w:t>
+        <w:t>chronx.io/exchange — seamless buy/sell interface embedded on the website. Market orders and limit orders. No account. No KYC for standard amounts. Powered by 1inch Fusion+ with MEV protection. Best price guaranteed across all DEXes.</w:t>
       </w:r>
     </w:p>
     <w:p>
@@ -9019,7 +9055,8 @@
         <w:spacing w:before="60" w:after="60"/>
       </w:pPr>
       <w:r>
-        <w:t>Mobile wallet UX refinement (iOS support)</w:t>
+        <w:lastRenderedPageBreak/>
+        <w:t>Wallet support — MetaMask, Coinbase Wallet, Trust Wallet, Binance Web3 Wallet, Rainbow, Phantom, and all WalletConnect-compatible wallets (300+). One interface, every major wallet.</w:t>
       </w:r>
     </w:p>
     <w:p>
@@ -9032,7 +9069,7 @@
         <w:spacing w:before="60" w:after="60"/>
       </w:pPr>
       <w:r>
-        <w:t>Walletless onboarding — account abstraction for non-crypto users</w:t>
+        <w:t>CoinMarketCap listing application — submitted at exchange launch. CMC tracks live price, volume, market cap, and charts from the 1inch pool. Approval 2–8 weeks. Application URL: coinmarketcap.com/application-form/listing/</w:t>
       </w:r>
     </w:p>
     <w:p>
@@ -9045,7 +9082,7 @@
         <w:spacing w:before="60" w:after="60"/>
       </w:pPr>
       <w:r>
-        <w:t>Block explorer — public transaction and time-lock browser</w:t>
+        <w:t>CoinGecko listing application — submitted simultaneously with CMC. Typically faster approval. Application URL: coingecko.com/en/coins/new</w:t>
       </w:r>
     </w:p>
     <w:p>
@@ -9058,7 +9095,7 @@
         <w:spacing w:before="60" w:after="60"/>
       </w:pPr>
       <w:r>
-        <w:t>Real-time network analytics — live blockchain data on chronx.io</w:t>
+        <w:t>DEX-first for up to one year — primary trading venue while CEX listing agreements are negotiated. Prioritizes user safety over speed.</w:t>
       </w:r>
     </w:p>
     <w:p>
@@ -9071,7 +9108,29 @@
         <w:spacing w:before="60" w:after="60"/>
       </w:pPr>
       <w:r>
-        <w:t>Scarcity visualization — charts showing locked supply and circulating supply over time</w:t>
+        <w:t>CEX listings — targeted 12–18 months post-launch on reputable mid-tier exchanges. CEX will complement, not replace, the DEX interface.</w:t>
+      </w:r>
+    </w:p>
+    <w:p>
+      <w:pPr>
+        <w:spacing w:before="120"/>
+      </w:pPr>
+    </w:p>
+    <w:p>
+      <w:pPr>
+        <w:pStyle w:val="Heading2"/>
+      </w:pPr>
+      <w:r>
+        <w:t>Phase 3 — Accessibility</w:t>
+      </w:r>
+    </w:p>
+    <w:p>
+      <w:pPr>
+        <w:spacing w:before="80" w:after="120"/>
+        <w:jc w:val="both"/>
+      </w:pPr>
+      <w:r>
+        <w:t>Phase 3 removes the remaining barriers to mainstream adoption — making ChronX usable by people who have never touched cryptocurrency before.</w:t>
       </w:r>
     </w:p>
     <w:p>
@@ -9084,7 +9143,7 @@
         <w:spacing w:before="60" w:after="60"/>
       </w:pPr>
       <w:r>
-        <w:t>Developer SDK and documentation</w:t>
+        <w:t>Email-based locks — send KX to an email address, recipient claims by downloading the wallet</w:t>
       </w:r>
     </w:p>
     <w:p>
@@ -9097,7 +9156,7 @@
         <w:spacing w:before="60" w:after="60"/>
       </w:pPr>
       <w:r>
-        <w:t>Multi-language wallet — Settings → Language selector for major world languages</w:t>
+        <w:t>Off-chain email notification service — watches chain, sends claim notifications automatically</w:t>
       </w:r>
     </w:p>
     <w:p>
@@ -9110,20 +9169,7 @@
         <w:spacing w:before="60" w:after="60"/>
       </w:pPr>
       <w:r>
-        <w:t>Biometric authentication — Windows Hello (desktop), Face ID / fingerprint (Android)</w:t>
-      </w:r>
-    </w:p>
-    <w:p>
-      <w:pPr>
-        <w:spacing w:before="120"/>
-      </w:pPr>
-    </w:p>
-    <w:p>
-      <w:pPr>
-        <w:pStyle w:val="Heading2"/>
-      </w:pPr>
-      <w:r>
-        <w:t>Phase 3 — Claim Resolution</w:t>
+        <w:t>Web wallet interface — use ChronX from any browser without installing an app</w:t>
       </w:r>
     </w:p>
     <w:p>
@@ -9136,7 +9182,7 @@
         <w:spacing w:before="60" w:after="60"/>
       </w:pPr>
       <w:r>
-        <w:t>Claim Agent registry and bonding mechanism</w:t>
+        <w:t>Mobile wallet UX refinement — iOS support</w:t>
       </w:r>
     </w:p>
     <w:p>
@@ -9149,8 +9195,7 @@
         <w:spacing w:before="60" w:after="60"/>
       </w:pPr>
       <w:r>
-        <w:lastRenderedPageBreak/>
-        <w:t>Attestor registry and Compliance Certificate framework</w:t>
+        <w:t>Walletless onboarding — account abstraction for non-crypto users</w:t>
       </w:r>
     </w:p>
     <w:p>
@@ -9163,7 +9208,7 @@
         <w:spacing w:before="60" w:after="60"/>
       </w:pPr>
       <w:r>
-        <w:t>Ambiguity Mode and interpretation policy engine</w:t>
+        <w:t>Block explorer — public transaction and time-lock browser at chronx.io/explorer</w:t>
       </w:r>
     </w:p>
     <w:p>
@@ -9176,7 +9221,7 @@
         <w:spacing w:before="60" w:after="60"/>
       </w:pPr>
       <w:r>
-        <w:t>Commit-reveal claim submission (frontrunning prevention)</w:t>
+        <w:t>Real-time network analytics — live blockchain data and scarcity charts on chronx.io</w:t>
       </w:r>
     </w:p>
     <w:p>
@@ -9189,7 +9234,7 @@
         <w:spacing w:before="60" w:after="60"/>
       </w:pPr>
       <w:r>
-        <w:t>Challenge window and bond slashing</w:t>
+        <w:t>Developer SDK and documentation</w:t>
       </w:r>
     </w:p>
     <w:p>
@@ -9202,7 +9247,7 @@
         <w:spacing w:before="60" w:after="60"/>
       </w:pPr>
       <w:r>
-        <w:t>Oracle network for KX/fiat price snapshots</w:t>
+        <w:t>Multi-language wallet — Settings → Language selector for major world languages</w:t>
       </w:r>
     </w:p>
     <w:p>
@@ -9215,7 +9260,29 @@
         <w:spacing w:before="60" w:after="60"/>
       </w:pPr>
       <w:r>
-        <w:t>Value-tier lane selection (Trivial / Standard / Elevated)</w:t>
+        <w:t>Biometric authentication — Windows Hello (desktop), Face ID / fingerprint (Android)</w:t>
+      </w:r>
+    </w:p>
+    <w:p>
+      <w:pPr>
+        <w:spacing w:before="120"/>
+      </w:pPr>
+    </w:p>
+    <w:p>
+      <w:pPr>
+        <w:pStyle w:val="Heading2"/>
+      </w:pPr>
+      <w:r>
+        <w:t>Phase 4 — Institutional Infrastructure</w:t>
+      </w:r>
+    </w:p>
+    <w:p>
+      <w:pPr>
+        <w:spacing w:before="80" w:after="120"/>
+        <w:jc w:val="both"/>
+      </w:pPr>
+      <w:r>
+        <w:t>Phase 4 makes ChronX viable for professional, corporate, and legal use cases requiring audit trails, compliance controls, and multi-party authorization.</w:t>
       </w:r>
     </w:p>
     <w:p>
@@ -9228,20 +9295,7 @@
         <w:spacing w:before="60" w:after="60"/>
       </w:pPr>
       <w:r>
-        <w:t>Social recovery protocol for lost keys</w:t>
-      </w:r>
-    </w:p>
-    <w:p>
-      <w:pPr>
-        <w:spacing w:before="120"/>
-      </w:pPr>
-    </w:p>
-    <w:p>
-      <w:pPr>
-        <w:pStyle w:val="Heading2"/>
-      </w:pPr>
-      <w:r>
-        <w:t>Phase 4 — Institutional Infrastructure</w:t>
+        <w:t>Multi-signature locks — require M-of-N signatories to claim</w:t>
       </w:r>
     </w:p>
     <w:p>
@@ -9254,7 +9308,7 @@
         <w:spacing w:before="60" w:after="60"/>
       </w:pPr>
       <w:r>
-        <w:t>Governance for protocol parameter updates and registry management</w:t>
+        <w:t>Institutional wallet with policy controls and audit trails</w:t>
       </w:r>
     </w:p>
     <w:p>
@@ -9280,7 +9334,7 @@
         <w:spacing w:before="60" w:after="60"/>
       </w:pPr>
       <w:r>
-        <w:t>Institutional wallet with policy controls and audit trails</w:t>
+        <w:t>Long-horizon compliance tooling for legal professionals</w:t>
       </w:r>
     </w:p>
     <w:p>
@@ -9293,7 +9347,30 @@
         <w:spacing w:before="60" w:after="60"/>
       </w:pPr>
       <w:r>
-        <w:t>Long-horizon compliance tooling for legal professionals</w:t>
+        <w:t>Governance for protocol parameter updates and registry management</w:t>
+      </w:r>
+    </w:p>
+    <w:p>
+      <w:pPr>
+        <w:spacing w:before="120"/>
+      </w:pPr>
+    </w:p>
+    <w:p>
+      <w:pPr>
+        <w:pStyle w:val="Heading2"/>
+      </w:pPr>
+      <w:r>
+        <w:t>Phase 5 — Claim Resolution</w:t>
+      </w:r>
+    </w:p>
+    <w:p>
+      <w:pPr>
+        <w:spacing w:before="80" w:after="120"/>
+        <w:jc w:val="both"/>
+      </w:pPr>
+      <w:r>
+        <w:lastRenderedPageBreak/>
+        <w:t>Phase 5 introduces the Claim Agent network — a bonded, incentive-aligned layer for resolving ambiguous or conditional lock claims. This is the infrastructure that makes ChronX viable for complex real-world agreements where simple time-based release is not sufficient.</w:t>
       </w:r>
     </w:p>
     <w:p>
@@ -9306,7 +9383,7 @@
         <w:spacing w:before="60" w:after="60"/>
       </w:pPr>
       <w:r>
-        <w:t>Multi-signature locks (require M-of-N to claim)</w:t>
+        <w:t>Claim Agent registry and bonding mechanism</w:t>
       </w:r>
     </w:p>
     <w:p>
@@ -9319,29 +9396,7 @@
         <w:spacing w:before="60" w:after="60"/>
       </w:pPr>
       <w:r>
-        <w:t>DEX integration (if it serves utility, not speculation)</w:t>
-      </w:r>
-    </w:p>
-    <w:p>
-      <w:pPr>
-        <w:spacing w:before="120"/>
-      </w:pPr>
-    </w:p>
-    <w:p>
-      <w:pPr>
-        <w:pStyle w:val="Heading2"/>
-      </w:pPr>
-      <w:r>
-        <w:t>Phase 5 — Liquidity Infrastructure</w:t>
-      </w:r>
-    </w:p>
-    <w:p>
-      <w:pPr>
-        <w:spacing w:before="80" w:after="120"/>
-        <w:jc w:val="both"/>
-      </w:pPr>
-      <w:r>
-        <w:t>Phase 5 brings KX to decentralized exchanges through a simple, seamless interface that makes buying and selling KX accessible to anyone — without requiring a centralized exchange listing. The experience is designed to feel as simple as any consumer app: enter an amount, connect a wallet, done.</w:t>
+        <w:t>Attestor registry and Compliance Certificate framework</w:t>
       </w:r>
     </w:p>
     <w:p>
@@ -9354,7 +9409,7 @@
         <w:spacing w:before="60" w:after="60"/>
       </w:pPr>
       <w:r>
-        <w:t>Wrapped KX (wKX) — a 1:1 backed ERC-20 token deployed on Base (Coinbase’s L2), redeemable for native KX at any time. Users never need to know the word ‘wrapped’ — the interface handles everything transparently.</w:t>
+        <w:t>Ambiguity Mode and interpretation policy engine</w:t>
       </w:r>
     </w:p>
     <w:p>
@@ -9367,7 +9422,7 @@
         <w:spacing w:before="60" w:after="60"/>
       </w:pPr>
       <w:r>
-        <w:t>chronx.io/exchange — a fully embedded buy/sell interface on the ChronX website powered by 1inch on Base. Supports both market orders and limit orders. Users set a price, walk away, and the order executes automatically when the market reaches it — no monitoring required. 1inch aggregates liquidity across all major DEXes for the best available price on every trade.</w:t>
+        <w:t>Commit-reveal claim submission (frontrunning prevention)</w:t>
       </w:r>
     </w:p>
     <w:p>
@@ -9380,7 +9435,7 @@
         <w:spacing w:before="60" w:after="60"/>
       </w:pPr>
       <w:r>
-        <w:t>Why 1inch — 1inch (https://1inch.io) is a leading decentralized exchange aggregator that routes trades across hundreds of liquidity sources simultaneously to guarantee the best available price. It supports limit orders natively, requires no account or KYC for standard amounts, and works with all major wallets including MetaMask, Coinbase Wallet, Trust Wallet, Binance Web3 Wallet, Rainbow, Phantom, and all WalletConnect-compatible wallets (300+). The 1inch Fusion+ protocol provides MEV protection, meaning users are shielded from front-running bots that exploit ordinary DEX trades. For a protocol designed around fairness and long-term trust, 1inch is the most aligned trading infrastructure available.</w:t>
+        <w:t>Challenge window and bond slashing</w:t>
       </w:r>
     </w:p>
     <w:p>
@@ -9393,7 +9448,7 @@
         <w:spacing w:before="60" w:after="60"/>
       </w:pPr>
       <w:r>
-        <w:t>Wallet support — MetaMask, Coinbase Wallet, Trust Wallet, Binance Web3 Wallet, Rainbow, Phantom, and all WalletConnect-compatible wallets (300+). One interface, every major wallet.</w:t>
+        <w:t>Oracle network for KX/fiat price snapshots</w:t>
       </w:r>
     </w:p>
     <w:p>
@@ -9406,8 +9461,7 @@
         <w:spacing w:before="60" w:after="60"/>
       </w:pPr>
       <w:r>
-        <w:lastRenderedPageBreak/>
-        <w:t>Buying flow — user connects wallet, enters USDC amount, sees KX price and slippage, confirms. KX arrives in their ChronX wallet within minutes. No account. No KYC for standard amounts. No intermediary.</w:t>
+        <w:t>Value-tier lane selection (Trivial / Standard / Elevated)</w:t>
       </w:r>
     </w:p>
     <w:p>
@@ -9420,7 +9474,29 @@
         <w:spacing w:before="60" w:after="60"/>
       </w:pPr>
       <w:r>
-        <w:t>Selling flow — user connects wallet, enters KX amount, receives USDC directly. The entire process takes under two minutes.</w:t>
+        <w:t>Social recovery protocol for lost keys</w:t>
+      </w:r>
+    </w:p>
+    <w:p>
+      <w:pPr>
+        <w:spacing w:before="120"/>
+      </w:pPr>
+    </w:p>
+    <w:p>
+      <w:pPr>
+        <w:pStyle w:val="Heading2"/>
+      </w:pPr>
+      <w:r>
+        <w:t>Phase 6 — Conditional Payments</w:t>
+      </w:r>
+    </w:p>
+    <w:p>
+      <w:pPr>
+        <w:spacing w:before="80" w:after="120"/>
+        <w:jc w:val="both"/>
+      </w:pPr>
+      <w:r>
+        <w:t>Phase 6 is the most complex phase and the most powerful. It introduces oracle-verified conditional payments — locks that release only if a specified real-world event is independently verified before a mandatory expiry date. If the condition is not verified in time, funds automatically revert to the sender. Phase 6 requires Phase 5’s Claim Agent network as its foundation.</w:t>
       </w:r>
     </w:p>
     <w:p>
@@ -9433,7 +9509,7 @@
         <w:spacing w:before="60" w:after="60"/>
       </w:pPr>
       <w:r>
-        <w:t>DEX-first strategy — the decentralized exchange interface will serve as the primary trading venue for up to one year post-launch while the team negotiates listing agreements with reputable centralized exchanges (CEX). This approach prioritizes user safety — no scammy micro-cap CEX listings, no hidden fees, no counterparty risk.</w:t>
+        <w:t>Condition description — plain English statement of the required event (e.g. ‘Mount Vesuvius erupts with Volcanic Explosivity Index ≥ 4’)</w:t>
       </w:r>
     </w:p>
     <w:p>
@@ -9446,7 +9522,7 @@
         <w:spacing w:before="60" w:after="60"/>
       </w:pPr>
       <w:r>
-        <w:t>CEX listings — targeted for 12–18 months post-launch on reputable mid-tier exchanges. CEX listings will complement, not replace, the DEX interface.</w:t>
+        <w:t>Mandatory condition expiry — every conditional payment has a deadline; open-ended conditions are not permitted by design</w:t>
       </w:r>
     </w:p>
     <w:p>
@@ -9459,7 +9535,7 @@
         <w:spacing w:before="60" w:after="60"/>
       </w:pPr>
       <w:r>
-        <w:t>Launch cost — approximately $540 total: ~$10 to deploy wKX on Base, ~$30 to create the liquidity pool, ~$500 to seed initial liquidity. A real, non-custodial market for under $600.</w:t>
+        <w:t>Oracle policy — sender specifies who may verify: any bonded agent, a specific named agent, M-of-N multi-sig attestation, or a registered external data feed</w:t>
       </w:r>
     </w:p>
     <w:p>
@@ -9472,7 +9548,7 @@
         <w:spacing w:before="60" w:after="60"/>
       </w:pPr>
       <w:r>
-        <w:t>Secondary market for pre-maturity claim rights (Pendle-style)</w:t>
+        <w:t>Condition precision levels — Exact (no interpretation), Interpretive (reasonable judgment), or Expert (specialist attestation with higher bond requirement)</w:t>
       </w:r>
     </w:p>
     <w:p>
@@ -9485,7 +9561,7 @@
         <w:spacing w:before="60" w:after="60"/>
       </w:pPr>
       <w:r>
-        <w:t>Sender-controlled transferability activation (transferable field)</w:t>
+        <w:t>Dispute window — a challenge period after attestation before funds release, protecting against fraudulent verification</w:t>
       </w:r>
     </w:p>
     <w:p>
@@ -9498,7 +9574,7 @@
         <w:spacing w:before="60" w:after="60"/>
       </w:pPr>
       <w:r>
-        <w:t>earliest_transfer_date enforcement — parental control on when transfer is permitted</w:t>
+        <w:t>External data feed registry — automatable conditions via price feeds, weather APIs, public records, and other verified data sources</w:t>
       </w:r>
     </w:p>
     <w:p>
@@ -9511,7 +9587,7 @@
         <w:spacing w:before="60" w:after="60"/>
       </w:pPr>
       <w:r>
-        <w:t>Discounted lock trading — beneficiaries can liquidate early at market price</w:t>
+        <w:t>Secondary market for pre-maturity claim rights (Pendle-style)</w:t>
       </w:r>
     </w:p>
     <w:p>
@@ -9524,7 +9600,7 @@
         <w:spacing w:before="60" w:after="60"/>
       </w:pPr>
       <w:r>
-        <w:t>Yield curve for KX time-value across lock durations</w:t>
+        <w:t>Sender-controlled transferability activation</w:t>
       </w:r>
     </w:p>
     <w:p>
@@ -9537,29 +9613,7 @@
         <w:spacing w:before="60" w:after="60"/>
       </w:pPr>
       <w:r>
-        <w:t>Institutional liquidity pools for large-value locks</w:t>
-      </w:r>
-    </w:p>
-    <w:p>
-      <w:pPr>
-        <w:spacing w:before="120"/>
-      </w:pPr>
-    </w:p>
-    <w:p>
-      <w:pPr>
-        <w:pStyle w:val="Heading2"/>
-      </w:pPr>
-      <w:r>
-        <w:t>Phase 6 — Conditional Payments</w:t>
-      </w:r>
-    </w:p>
-    <w:p>
-      <w:pPr>
-        <w:spacing w:before="80" w:after="120"/>
-        <w:jc w:val="both"/>
-      </w:pPr>
-      <w:r>
-        <w:t>Phase 6 introduces oracle-verified conditional payments — perhaps ChronX’s most powerful long-horizon primitive. A conditional payment releases funds only if a specified real-world event is independently verified before a mandatory expiry date. If the condition is not verified in time, funds automatically revert to the sender.</w:t>
+        <w:t>Discounted lock trading — beneficiaries can liquidate early at market price</w:t>
       </w:r>
     </w:p>
     <w:p>
@@ -9572,7 +9626,7 @@
         <w:spacing w:before="60" w:after="60"/>
       </w:pPr>
       <w:r>
-        <w:t>Condition description — plain English statement of the required event (e.g. ‘Mount Vesuvius erupts with Volcanic Explosivity Index ≥ 4’)</w:t>
+        <w:t>Yield curve for KX time-value across lock durations</w:t>
       </w:r>
     </w:p>
     <w:p>
@@ -9585,59 +9639,7 @@
         <w:spacing w:before="60" w:after="60"/>
       </w:pPr>
       <w:r>
-        <w:t>Mandatory condition expiry — every conditional payment has a deadline; open-ended conditions are not permitted by design</w:t>
-      </w:r>
-    </w:p>
-    <w:p>
-      <w:pPr>
-        <w:pStyle w:val="ListParagraph"/>
-        <w:numPr>
-          <w:ilvl w:val="0"/>
-          <w:numId w:val="2"/>
-        </w:numPr>
-        <w:spacing w:before="60" w:after="60"/>
-      </w:pPr>
-      <w:r>
-        <w:t>Oracle policy — sender specifies who may verify: any bonded agent, a specific named agent, M-of-N multi-sig attestation, or a registered external data feed</w:t>
-      </w:r>
-    </w:p>
-    <w:p>
-      <w:pPr>
-        <w:pStyle w:val="ListParagraph"/>
-        <w:numPr>
-          <w:ilvl w:val="0"/>
-          <w:numId w:val="2"/>
-        </w:numPr>
-        <w:spacing w:before="60" w:after="60"/>
-      </w:pPr>
-      <w:r>
-        <w:t>Condition precision levels — Exact (no interpretation), Interpretive (reasonable judgment), or Expert (specialist attestation with higher bond requirement)</w:t>
-      </w:r>
-    </w:p>
-    <w:p>
-      <w:pPr>
-        <w:pStyle w:val="ListParagraph"/>
-        <w:numPr>
-          <w:ilvl w:val="0"/>
-          <w:numId w:val="2"/>
-        </w:numPr>
-        <w:spacing w:before="60" w:after="60"/>
-      </w:pPr>
-      <w:r>
-        <w:t>Dispute window — a challenge period after attestation before funds release, protecting against fraudulent verification</w:t>
-      </w:r>
-    </w:p>
-    <w:p>
-      <w:pPr>
-        <w:pStyle w:val="ListParagraph"/>
-        <w:numPr>
-          <w:ilvl w:val="0"/>
-          <w:numId w:val="2"/>
-        </w:numPr>
-        <w:spacing w:before="60" w:after="60"/>
-      </w:pPr>
-      <w:r>
-        <w:t>External data feed registry — automatable conditions via price feeds, weather APIs, public records, and other verified data sources</w:t>
+        <w:t>Institutional liquidity pools for large-value locks</w:t>
       </w:r>
     </w:p>
     <w:p>
@@ -9714,7 +9716,7 @@
                 <w:sz w:val="21"/>
                 <w:szCs w:val="21"/>
               </w:rPr>
-              <w:t xml:space="preserve">Lock 50,000 KX for your spouse, payable upon verified death of the sender, before December 31, 2075. If not verified by the expiry date, funds revert automatically. The condition is attested </w:t>
+              <w:t xml:space="preserve">Lock 50,000 KX for your spouse, payable upon verified death of the sender, before December 31, 2075. If not verified by the expiry date, funds revert automatically. The condition is attested by a bonded Claim Agent using public death records. No lawyer. No probate court. No custodian. A promise kept — or returned — by the protocol itself.  All data structures for conditional </w:t>
             </w:r>
             <w:r>
               <w:rPr>
@@ -9722,7 +9724,7 @@
                 <w:szCs w:val="21"/>
               </w:rPr>
               <w:lastRenderedPageBreak/>
-              <w:t>by a bonded Claim Agent using public death records. No lawyer. No probate court. No custodian. A promise kept — or returned — by the protocol itself.  All data structures for conditional payments are present in the ChronX protocol from genesis — no hard fork required to activate this feature.</w:t>
+              <w:t>payments are present in the ChronX protocol from genesis — no hard fork required to activate this feature.</w:t>
             </w:r>
           </w:p>
         </w:tc>
@@ -9836,7 +9838,6 @@
         <w:pStyle w:val="Heading1"/>
       </w:pPr>
       <w:r>
-        <w:lastRenderedPageBreak/>
         <w:t>12. Vision: The Default Protocol for Future Payments</w:t>
       </w:r>
     </w:p>
@@ -9846,6 +9847,7 @@
         <w:jc w:val="both"/>
       </w:pPr>
       <w:r>
+        <w:lastRenderedPageBreak/>
         <w:t>In five years, the ChronX team envisions a world where sending value to the future is as normal as sending value today. A parent opens the ChronX wallet, locks 10,000 KX for their newborn, and knows — not hopes, but knows — that those funds will be there when the child turns 18. A professional structures deferred compensation with policy conditions. A person in one country sends value to a trusted friend in another, with an unlock date decades away, without any bank or court standing between the sender’s intent and the recipient’s claim.</w:t>
       </w:r>
     </w:p>
@@ -10478,7 +10480,6 @@
                 <w:sz w:val="20"/>
                 <w:szCs w:val="20"/>
               </w:rPr>
-              <w:lastRenderedPageBreak/>
               <w:t>Public Key Size</w:t>
             </w:r>
           </w:p>
@@ -10603,6 +10604,7 @@
                 <w:sz w:val="20"/>
                 <w:szCs w:val="20"/>
               </w:rPr>
+              <w:lastRenderedPageBreak/>
               <w:t>Account ID</w:t>
             </w:r>
           </w:p>
@@ -12252,7 +12254,6 @@
                 <w:sz w:val="20"/>
                 <w:szCs w:val="20"/>
               </w:rPr>
-              <w:lastRenderedPageBreak/>
               <w:t>Humanity Stake</w:t>
             </w:r>
           </w:p>
@@ -12485,6 +12486,7 @@
                 <w:sz w:val="20"/>
                 <w:szCs w:val="20"/>
               </w:rPr>
+              <w:lastRenderedPageBreak/>
               <w:t>Protocol Reserve</w:t>
             </w:r>
           </w:p>
@@ -15652,7 +15654,6 @@
                 <w:sz w:val="20"/>
                 <w:szCs w:val="20"/>
               </w:rPr>
-              <w:lastRenderedPageBreak/>
               <w:t>current_beneficiary</w:t>
             </w:r>
           </w:p>
@@ -15939,6 +15940,7 @@
                 <w:sz w:val="20"/>
                 <w:szCs w:val="20"/>
               </w:rPr>
+              <w:lastRenderedPageBreak/>
               <w:t>earliest_transfer_date</w:t>
             </w:r>
           </w:p>
@@ -16869,15 +16871,15 @@
         <w:spacing w:before="60" w:after="60"/>
       </w:pPr>
       <w:r>
+        <w:t>Base (L2) — https://base.org — Coinbase’s Ethereum Layer 2 network. Used for Wrapped KX (wKX) ERC-20 deployment and 1inch liquidity pool. Selected for low gas fees (~$0.01/tx), large user base, and Coinbase integration.</w:t>
+      </w:r>
+    </w:p>
+    <w:p>
+      <w:pPr>
+        <w:pStyle w:val="Heading2"/>
+      </w:pPr>
+      <w:r>
         <w:lastRenderedPageBreak/>
-        <w:t>Base (L2) — https://base.org — Coinbase’s Ethereum Layer 2 network. Used for Wrapped KX (wKX) ERC-20 deployment and 1inch liquidity pool. Selected for low gas fees (~$0.01/tx), large user base, and Coinbase integration.</w:t>
-      </w:r>
-    </w:p>
-    <w:p>
-      <w:pPr>
-        <w:pStyle w:val="Heading2"/>
-      </w:pPr>
-      <w:r>
         <w:t>15.2 Exchange &amp; Liquidity</w:t>
       </w:r>
     </w:p>
@@ -17118,7 +17120,6 @@
         <w:spacing w:before="60" w:after="60"/>
       </w:pPr>
       <w:r>
-        <w:lastRenderedPageBreak/>
         <w:t>Wallet repo — https://github.com/Counselco/wallet-gui — ChronX desktop and Android wallet. Language: Rust (Tauri + Yew).</w:t>
       </w:r>
     </w:p>
@@ -17140,6 +17141,7 @@
         <w:pStyle w:val="Heading2"/>
       </w:pPr>
       <w:r>
+        <w:lastRenderedPageBreak/>
         <w:t>15.7 Communication</w:t>
       </w:r>
     </w:p>
@@ -17202,6 +17204,58 @@
     </w:p>
     <w:p>
       <w:pPr>
+        <w:pStyle w:val="Heading2"/>
+      </w:pPr>
+      <w:r>
+        <w:t>15.8 Price Tracking &amp; Market Data</w:t>
+      </w:r>
+    </w:p>
+    <w:p>
+      <w:pPr>
+        <w:pStyle w:val="ListParagraph"/>
+        <w:numPr>
+          <w:ilvl w:val="0"/>
+          <w:numId w:val="2"/>
+        </w:numPr>
+        <w:spacing w:before="60" w:after="60"/>
+      </w:pPr>
+      <w:r>
+        <w:t>CoinMarketCap — https://coinmarketcap.com — Primary price tracking and market data platform. Listing application submitted at launch of wKX on Base. CMC pulls live price, volume, market cap, circulating supply, and chart data directly from the 1inch/Base liquidity pool. Application URL: coinmarketcap.com/application-form/listing/. Approval typically 2–8 weeks. The ‘View KX on CoinMarketCap’ button in the ChronX wallet links to the KX listing page once approved.</w:t>
+      </w:r>
+    </w:p>
+    <w:p>
+      <w:pPr>
+        <w:pStyle w:val="ListParagraph"/>
+        <w:numPr>
+          <w:ilvl w:val="0"/>
+          <w:numId w:val="2"/>
+        </w:numPr>
+        <w:spacing w:before="60" w:after="60"/>
+      </w:pPr>
+      <w:r>
+        <w:t>CoinGecko — https://coingecko.com — Secondary price tracking platform. Applied simultaneously with CoinMarketCap. Typically faster approval. Application URL: coingecko.com/en/coins/new. Many traders use CoinGecko as their primary reference — dual listing maximizes visibility.</w:t>
+      </w:r>
+    </w:p>
+    <w:p>
+      <w:pPr>
+        <w:pStyle w:val="ListParagraph"/>
+        <w:numPr>
+          <w:ilvl w:val="0"/>
+          <w:numId w:val="2"/>
+        </w:numPr>
+        <w:spacing w:before="60" w:after="60"/>
+      </w:pPr>
+      <w:r>
+        <w:t>Listing requirements — both platforms require: minimum $10,000 liquidity in the trading pool, some trading volume, working website, whitepaper, GitHub repository, and contact information. ChronX meets all requirements from day one of the exchange launch.</w:t>
+      </w:r>
+    </w:p>
+    <w:p>
+      <w:pPr>
+        <w:spacing w:before="160"/>
+      </w:pPr>
+    </w:p>
+    <w:p>
+      <w:pPr>
         <w:pStyle w:val="Heading1"/>
       </w:pPr>
       <w:r>
@@ -17250,10 +17304,10 @@
           <w:noProof/>
         </w:rPr>
         <w:drawing>
-          <wp:inline distT="0" distB="0" distL="0" distR="0" wp14:anchorId="0D3F9AB2" wp14:editId="5C1E555C">
+          <wp:inline distT="0" distB="0" distL="0" distR="0" wp14:anchorId="7F0B71A5" wp14:editId="7513C8F0">
             <wp:extent cx="1333500" cy="219075"/>
             <wp:effectExtent l="0" t="0" r="0" b="0"/>
-            <wp:docPr id="486833227" name="ChronX Logo" descr="ChronX Logo" title="ChronX"/>
+            <wp:docPr id="59564869" name="ChronX Logo" descr="ChronX Logo" title="ChronX"/>
             <wp:cNvGraphicFramePr>
               <a:graphicFrameLocks xmlns:a="http://schemas.openxmlformats.org/drawingml/2006/main" noChangeAspect="1"/>
             </wp:cNvGraphicFramePr>
@@ -17492,267 +17546,267 @@
 <file path=word/numbering.xml><?xml version="1.0" encoding="utf-8"?>
 <w:numbering xmlns:wpc="http://schemas.microsoft.com/office/word/2010/wordprocessingCanvas" xmlns:cx="http://schemas.microsoft.com/office/drawing/2014/chartex" xmlns:cx1="http://schemas.microsoft.com/office/drawing/2015/9/8/chartex" xmlns:cx2="http://schemas.microsoft.com/office/drawing/2015/10/21/chartex" xmlns:cx3="http://schemas.microsoft.com/office/drawing/2016/5/9/chartex" xmlns:cx4="http://schemas.microsoft.com/office/drawing/2016/5/10/chartex" xmlns:cx5="http://schemas.microsoft.com/office/drawing/2016/5/11/chartex" xmlns:cx6="http://schemas.microsoft.com/office/drawing/2016/5/12/chartex" xmlns:cx7="http://schemas.microsoft.com/office/drawing/2016/5/13/chartex" xmlns:cx8="http://schemas.microsoft.com/office/drawing/2016/5/14/chartex" xmlns:mc="http://schemas.openxmlformats.org/markup-compatibility/2006" xmlns:aink="http://schemas.microsoft.com/office/drawing/2016/ink" xmlns:am3d="http://schemas.microsoft.com/office/drawing/2017/model3d" xmlns:o="urn:schemas-microsoft-com:office:office" xmlns:oel="http://schemas.microsoft.com/office/2019/extlst" xmlns:r="http://schemas.openxmlformats.org/officeDocument/2006/relationships" xmlns:m="http://schemas.openxmlformats.org/officeDocument/2006/math" xmlns:v="urn:schemas-microsoft-com:vml" xmlns:wp14="http://schemas.microsoft.com/office/word/2010/wordprocessingDrawing" xmlns:wp="http://schemas.openxmlformats.org/drawingml/2006/wordprocessingDrawing" xmlns:w10="urn:schemas-microsoft-com:office:word" xmlns:w="http://schemas.openxmlformats.org/wordprocessingml/2006/main" xmlns:w14="http://schemas.microsoft.com/office/word/2010/wordml" xmlns:w15="http://schemas.microsoft.com/office/word/2012/wordml" xmlns:w16cex="http://schemas.microsoft.com/office/word/2018/wordml/cex" xmlns:w16cid="http://schemas.microsoft.com/office/word/2016/wordml/cid" xmlns:w16="http://schemas.microsoft.com/office/word/2018/wordml" xmlns:w16du="http://schemas.microsoft.com/office/word/2023/wordml/word16du" xmlns:w16sdtdh="http://schemas.microsoft.com/office/word/2020/wordml/sdtdatahash" xmlns:w16sdtfl="http://schemas.microsoft.com/office/word/2024/wordml/sdtformatlock" xmlns:w16se="http://schemas.microsoft.com/office/word/2015/wordml/symex" xmlns:wpg="http://schemas.microsoft.com/office/word/2010/wordprocessingGroup" xmlns:wpi="http://schemas.microsoft.com/office/word/2010/wordprocessingInk" xmlns:wne="http://schemas.microsoft.com/office/word/2006/wordml" xmlns:wps="http://schemas.microsoft.com/office/word/2010/wordprocessingShape" mc:Ignorable="w14 w15 w16se w16cid w16 w16cex w16sdtdh w16sdtfl w16du wp14">
   <w:abstractNum w:abstractNumId="0" w15:restartNumberingAfterBreak="0">
-    <w:nsid w:val="0BFB5A68"/>
+    <w:nsid w:val="0692317B"/>
     <w:multiLevelType w:val="hybridMultilevel"/>
-    <w:tmpl w:val="1C7627DE"/>
-    <w:lvl w:ilvl="0" w:tplc="C590BBAE">
+    <w:tmpl w:val="15D639EC"/>
+    <w:lvl w:ilvl="0" w:tplc="7FE0406C">
       <w:start w:val="1"/>
       <w:numFmt w:val="bullet"/>
-      <w:lvlText w:val="✓"/>
+      <w:lvlText w:val="•"/>
       <w:lvlJc w:val="left"/>
       <w:pPr>
         <w:ind w:left="720" w:hanging="360"/>
       </w:pPr>
     </w:lvl>
-    <w:lvl w:ilvl="1" w:tplc="8A58D8DC">
+    <w:lvl w:ilvl="1" w:tplc="BBC4E8B4">
       <w:numFmt w:val="decimal"/>
       <w:lvlText w:val=""/>
       <w:lvlJc w:val="left"/>
     </w:lvl>
-    <w:lvl w:ilvl="2" w:tplc="16C4AB02">
+    <w:lvl w:ilvl="2" w:tplc="C5DE8ED8">
       <w:numFmt w:val="decimal"/>
       <w:lvlText w:val=""/>
       <w:lvlJc w:val="left"/>
     </w:lvl>
-    <w:lvl w:ilvl="3" w:tplc="1DD01CD4">
+    <w:lvl w:ilvl="3" w:tplc="88DCBF78">
       <w:numFmt w:val="decimal"/>
       <w:lvlText w:val=""/>
       <w:lvlJc w:val="left"/>
     </w:lvl>
-    <w:lvl w:ilvl="4" w:tplc="78B6807E">
+    <w:lvl w:ilvl="4" w:tplc="09265A04">
       <w:numFmt w:val="decimal"/>
       <w:lvlText w:val=""/>
       <w:lvlJc w:val="left"/>
     </w:lvl>
-    <w:lvl w:ilvl="5" w:tplc="D1F2EC4A">
+    <w:lvl w:ilvl="5" w:tplc="AABC9A80">
       <w:numFmt w:val="decimal"/>
       <w:lvlText w:val=""/>
       <w:lvlJc w:val="left"/>
     </w:lvl>
-    <w:lvl w:ilvl="6" w:tplc="9C0292A8">
+    <w:lvl w:ilvl="6" w:tplc="85604538">
       <w:numFmt w:val="decimal"/>
       <w:lvlText w:val=""/>
       <w:lvlJc w:val="left"/>
     </w:lvl>
-    <w:lvl w:ilvl="7" w:tplc="CBF87C1E">
+    <w:lvl w:ilvl="7" w:tplc="03C4F73A">
       <w:numFmt w:val="decimal"/>
       <w:lvlText w:val=""/>
       <w:lvlJc w:val="left"/>
     </w:lvl>
-    <w:lvl w:ilvl="8" w:tplc="FDA08D1E">
+    <w:lvl w:ilvl="8" w:tplc="0F84B2E0">
       <w:numFmt w:val="decimal"/>
       <w:lvlText w:val=""/>
       <w:lvlJc w:val="left"/>
     </w:lvl>
   </w:abstractNum>
   <w:abstractNum w:abstractNumId="1" w15:restartNumberingAfterBreak="0">
-    <w:nsid w:val="29683EF8"/>
+    <w:nsid w:val="2B1863FF"/>
     <w:multiLevelType w:val="hybridMultilevel"/>
-    <w:tmpl w:val="CDEA224A"/>
-    <w:lvl w:ilvl="0" w:tplc="E5B2998C">
+    <w:tmpl w:val="FA8EC84C"/>
+    <w:lvl w:ilvl="0" w:tplc="B0ECCC60">
       <w:start w:val="1"/>
-      <w:numFmt w:val="bullet"/>
-      <w:lvlText w:val="•"/>
+      <w:numFmt w:val="decimal"/>
+      <w:lvlText w:val="%1."/>
       <w:lvlJc w:val="left"/>
       <w:pPr>
         <w:ind w:left="720" w:hanging="360"/>
       </w:pPr>
     </w:lvl>
-    <w:lvl w:ilvl="1" w:tplc="28D83516">
+    <w:lvl w:ilvl="1" w:tplc="36721FE6">
       <w:numFmt w:val="decimal"/>
       <w:lvlText w:val=""/>
       <w:lvlJc w:val="left"/>
     </w:lvl>
-    <w:lvl w:ilvl="2" w:tplc="1A70C526">
+    <w:lvl w:ilvl="2" w:tplc="FF9EE63A">
       <w:numFmt w:val="decimal"/>
       <w:lvlText w:val=""/>
       <w:lvlJc w:val="left"/>
     </w:lvl>
-    <w:lvl w:ilvl="3" w:tplc="B9267C6E">
+    <w:lvl w:ilvl="3" w:tplc="BC64B91E">
       <w:numFmt w:val="decimal"/>
       <w:lvlText w:val=""/>
       <w:lvlJc w:val="left"/>
     </w:lvl>
-    <w:lvl w:ilvl="4" w:tplc="12CC58E2">
+    <w:lvl w:ilvl="4" w:tplc="663EE628">
       <w:numFmt w:val="decimal"/>
       <w:lvlText w:val=""/>
       <w:lvlJc w:val="left"/>
     </w:lvl>
-    <w:lvl w:ilvl="5" w:tplc="37BED11E">
+    <w:lvl w:ilvl="5" w:tplc="4A0C4582">
       <w:numFmt w:val="decimal"/>
       <w:lvlText w:val=""/>
       <w:lvlJc w:val="left"/>
     </w:lvl>
-    <w:lvl w:ilvl="6" w:tplc="294E0516">
+    <w:lvl w:ilvl="6" w:tplc="18DADAB4">
       <w:numFmt w:val="decimal"/>
       <w:lvlText w:val=""/>
       <w:lvlJc w:val="left"/>
     </w:lvl>
-    <w:lvl w:ilvl="7" w:tplc="7D86F9E2">
+    <w:lvl w:ilvl="7" w:tplc="A41A15B4">
       <w:numFmt w:val="decimal"/>
       <w:lvlText w:val=""/>
       <w:lvlJc w:val="left"/>
     </w:lvl>
-    <w:lvl w:ilvl="8" w:tplc="08307EBA">
+    <w:lvl w:ilvl="8" w:tplc="EB9ED352">
       <w:numFmt w:val="decimal"/>
       <w:lvlText w:val=""/>
       <w:lvlJc w:val="left"/>
     </w:lvl>
   </w:abstractNum>
   <w:abstractNum w:abstractNumId="2" w15:restartNumberingAfterBreak="0">
-    <w:nsid w:val="7E8A539C"/>
+    <w:nsid w:val="4761051B"/>
     <w:multiLevelType w:val="hybridMultilevel"/>
-    <w:tmpl w:val="93EEB7BE"/>
-    <w:lvl w:ilvl="0" w:tplc="62EC4C04">
+    <w:tmpl w:val="41301CA6"/>
+    <w:lvl w:ilvl="0" w:tplc="93FCABEA">
       <w:start w:val="1"/>
-      <w:numFmt w:val="decimal"/>
-      <w:lvlText w:val="%1."/>
+      <w:numFmt w:val="bullet"/>
+      <w:lvlText w:val="●"/>
       <w:lvlJc w:val="left"/>
       <w:pPr>
         <w:ind w:left="720" w:hanging="360"/>
       </w:pPr>
     </w:lvl>
-    <w:lvl w:ilvl="1" w:tplc="A118ACC0">
+    <w:lvl w:ilvl="1" w:tplc="A5845484">
+      <w:start w:val="1"/>
+      <w:numFmt w:val="bullet"/>
+      <w:lvlText w:val="○"/>
+      <w:lvlJc w:val="left"/>
+      <w:pPr>
+        <w:ind w:left="1440" w:hanging="360"/>
+      </w:pPr>
+    </w:lvl>
+    <w:lvl w:ilvl="2" w:tplc="B41AD4C2">
+      <w:start w:val="1"/>
+      <w:numFmt w:val="bullet"/>
+      <w:lvlText w:val="■"/>
+      <w:lvlJc w:val="left"/>
+      <w:pPr>
+        <w:ind w:left="2160" w:hanging="360"/>
+      </w:pPr>
+    </w:lvl>
+    <w:lvl w:ilvl="3" w:tplc="AA2A8C5C">
+      <w:start w:val="1"/>
+      <w:numFmt w:val="bullet"/>
+      <w:lvlText w:val="●"/>
+      <w:lvlJc w:val="left"/>
+      <w:pPr>
+        <w:ind w:left="2880" w:hanging="360"/>
+      </w:pPr>
+    </w:lvl>
+    <w:lvl w:ilvl="4" w:tplc="3D2AC486">
+      <w:start w:val="1"/>
+      <w:numFmt w:val="bullet"/>
+      <w:lvlText w:val="○"/>
+      <w:lvlJc w:val="left"/>
+      <w:pPr>
+        <w:ind w:left="3600" w:hanging="360"/>
+      </w:pPr>
+    </w:lvl>
+    <w:lvl w:ilvl="5" w:tplc="E15642B2">
+      <w:start w:val="1"/>
+      <w:numFmt w:val="bullet"/>
+      <w:lvlText w:val="■"/>
+      <w:lvlJc w:val="left"/>
+      <w:pPr>
+        <w:ind w:left="4320" w:hanging="360"/>
+      </w:pPr>
+    </w:lvl>
+    <w:lvl w:ilvl="6" w:tplc="3C3C3A56">
+      <w:start w:val="1"/>
+      <w:numFmt w:val="bullet"/>
+      <w:lvlText w:val="●"/>
+      <w:lvlJc w:val="left"/>
+      <w:pPr>
+        <w:ind w:left="5040" w:hanging="360"/>
+      </w:pPr>
+    </w:lvl>
+    <w:lvl w:ilvl="7" w:tplc="5C18703A">
+      <w:start w:val="1"/>
+      <w:numFmt w:val="bullet"/>
+      <w:lvlText w:val="●"/>
+      <w:lvlJc w:val="left"/>
+      <w:pPr>
+        <w:ind w:left="5760" w:hanging="360"/>
+      </w:pPr>
+    </w:lvl>
+    <w:lvl w:ilvl="8" w:tplc="E0189D8C">
+      <w:start w:val="1"/>
+      <w:numFmt w:val="bullet"/>
+      <w:lvlText w:val="●"/>
+      <w:lvlJc w:val="left"/>
+      <w:pPr>
+        <w:ind w:left="6480" w:hanging="360"/>
+      </w:pPr>
+    </w:lvl>
+  </w:abstractNum>
+  <w:abstractNum w:abstractNumId="3" w15:restartNumberingAfterBreak="0">
+    <w:nsid w:val="78786EDA"/>
+    <w:multiLevelType w:val="hybridMultilevel"/>
+    <w:tmpl w:val="D2546F64"/>
+    <w:lvl w:ilvl="0" w:tplc="B6FC5234">
+      <w:start w:val="1"/>
+      <w:numFmt w:val="bullet"/>
+      <w:lvlText w:val="✓"/>
+      <w:lvlJc w:val="left"/>
+      <w:pPr>
+        <w:ind w:left="720" w:hanging="360"/>
+      </w:pPr>
+    </w:lvl>
+    <w:lvl w:ilvl="1" w:tplc="FF54EA66">
       <w:numFmt w:val="decimal"/>
       <w:lvlText w:val=""/>
       <w:lvlJc w:val="left"/>
     </w:lvl>
-    <w:lvl w:ilvl="2" w:tplc="AC8283F8">
+    <w:lvl w:ilvl="2" w:tplc="F6C46476">
       <w:numFmt w:val="decimal"/>
       <w:lvlText w:val=""/>
       <w:lvlJc w:val="left"/>
     </w:lvl>
-    <w:lvl w:ilvl="3" w:tplc="2D4E8AD0">
+    <w:lvl w:ilvl="3" w:tplc="6D724D58">
       <w:numFmt w:val="decimal"/>
       <w:lvlText w:val=""/>
       <w:lvlJc w:val="left"/>
     </w:lvl>
-    <w:lvl w:ilvl="4" w:tplc="B75614A8">
+    <w:lvl w:ilvl="4" w:tplc="84FAD8EA">
       <w:numFmt w:val="decimal"/>
       <w:lvlText w:val=""/>
       <w:lvlJc w:val="left"/>
     </w:lvl>
-    <w:lvl w:ilvl="5" w:tplc="E028DE1E">
+    <w:lvl w:ilvl="5" w:tplc="24AE7012">
       <w:numFmt w:val="decimal"/>
       <w:lvlText w:val=""/>
       <w:lvlJc w:val="left"/>
     </w:lvl>
-    <w:lvl w:ilvl="6" w:tplc="C7EC57C0">
+    <w:lvl w:ilvl="6" w:tplc="D42C17D0">
       <w:numFmt w:val="decimal"/>
       <w:lvlText w:val=""/>
       <w:lvlJc w:val="left"/>
     </w:lvl>
-    <w:lvl w:ilvl="7" w:tplc="E8A8FB26">
+    <w:lvl w:ilvl="7" w:tplc="D65C0C48">
       <w:numFmt w:val="decimal"/>
       <w:lvlText w:val=""/>
       <w:lvlJc w:val="left"/>
     </w:lvl>
-    <w:lvl w:ilvl="8" w:tplc="66C27702">
+    <w:lvl w:ilvl="8" w:tplc="691CCBCE">
       <w:numFmt w:val="decimal"/>
       <w:lvlText w:val=""/>
       <w:lvlJc w:val="left"/>
     </w:lvl>
   </w:abstractNum>
-  <w:abstractNum w:abstractNumId="3" w15:restartNumberingAfterBreak="0">
-    <w:nsid w:val="7EC05118"/>
-    <w:multiLevelType w:val="hybridMultilevel"/>
-    <w:tmpl w:val="44E20E10"/>
-    <w:lvl w:ilvl="0" w:tplc="D952DB3A">
-      <w:start w:val="1"/>
-      <w:numFmt w:val="bullet"/>
-      <w:lvlText w:val="●"/>
-      <w:lvlJc w:val="left"/>
-      <w:pPr>
-        <w:ind w:left="720" w:hanging="360"/>
-      </w:pPr>
-    </w:lvl>
-    <w:lvl w:ilvl="1" w:tplc="F6502056">
-      <w:start w:val="1"/>
-      <w:numFmt w:val="bullet"/>
-      <w:lvlText w:val="○"/>
-      <w:lvlJc w:val="left"/>
-      <w:pPr>
-        <w:ind w:left="1440" w:hanging="360"/>
-      </w:pPr>
-    </w:lvl>
-    <w:lvl w:ilvl="2" w:tplc="0F0EC976">
-      <w:start w:val="1"/>
-      <w:numFmt w:val="bullet"/>
-      <w:lvlText w:val="■"/>
-      <w:lvlJc w:val="left"/>
-      <w:pPr>
-        <w:ind w:left="2160" w:hanging="360"/>
-      </w:pPr>
-    </w:lvl>
-    <w:lvl w:ilvl="3" w:tplc="3ADEDAB6">
-      <w:start w:val="1"/>
-      <w:numFmt w:val="bullet"/>
-      <w:lvlText w:val="●"/>
-      <w:lvlJc w:val="left"/>
-      <w:pPr>
-        <w:ind w:left="2880" w:hanging="360"/>
-      </w:pPr>
-    </w:lvl>
-    <w:lvl w:ilvl="4" w:tplc="1BBC49B6">
-      <w:start w:val="1"/>
-      <w:numFmt w:val="bullet"/>
-      <w:lvlText w:val="○"/>
-      <w:lvlJc w:val="left"/>
-      <w:pPr>
-        <w:ind w:left="3600" w:hanging="360"/>
-      </w:pPr>
-    </w:lvl>
-    <w:lvl w:ilvl="5" w:tplc="52D41044">
-      <w:start w:val="1"/>
-      <w:numFmt w:val="bullet"/>
-      <w:lvlText w:val="■"/>
-      <w:lvlJc w:val="left"/>
-      <w:pPr>
-        <w:ind w:left="4320" w:hanging="360"/>
-      </w:pPr>
-    </w:lvl>
-    <w:lvl w:ilvl="6" w:tplc="4DD68D3A">
-      <w:start w:val="1"/>
-      <w:numFmt w:val="bullet"/>
-      <w:lvlText w:val="●"/>
-      <w:lvlJc w:val="left"/>
-      <w:pPr>
-        <w:ind w:left="5040" w:hanging="360"/>
-      </w:pPr>
-    </w:lvl>
-    <w:lvl w:ilvl="7" w:tplc="95F42D54">
-      <w:start w:val="1"/>
-      <w:numFmt w:val="bullet"/>
-      <w:lvlText w:val="●"/>
-      <w:lvlJc w:val="left"/>
-      <w:pPr>
-        <w:ind w:left="5760" w:hanging="360"/>
-      </w:pPr>
-    </w:lvl>
-    <w:lvl w:ilvl="8" w:tplc="511E6A6A">
-      <w:start w:val="1"/>
-      <w:numFmt w:val="bullet"/>
-      <w:lvlText w:val="●"/>
-      <w:lvlJc w:val="left"/>
-      <w:pPr>
-        <w:ind w:left="6480" w:hanging="360"/>
-      </w:pPr>
-    </w:lvl>
-  </w:abstractNum>
-  <w:num w:numId="1" w16cid:durableId="1844978132">
-    <w:abstractNumId w:val="3"/>
+  <w:num w:numId="1" w16cid:durableId="366566302">
+    <w:abstractNumId w:val="2"/>
     <w:lvlOverride w:ilvl="0">
       <w:startOverride w:val="1"/>
     </w:lvlOverride>
   </w:num>
-  <w:num w:numId="2" w16cid:durableId="631325711">
-    <w:abstractNumId w:val="1"/>
+  <w:num w:numId="2" w16cid:durableId="2085451845">
+    <w:abstractNumId w:val="0"/>
     <w:lvlOverride w:ilvl="0">
       <w:startOverride w:val="1"/>
     </w:lvlOverride>
   </w:num>
-  <w:num w:numId="3" w16cid:durableId="1359352869">
-    <w:abstractNumId w:val="0"/>
+  <w:num w:numId="3" w16cid:durableId="1901012980">
+    <w:abstractNumId w:val="3"/>
     <w:lvlOverride w:ilvl="0">
       <w:startOverride w:val="1"/>
     </w:lvlOverride>

</xml_diff>